<commit_message>
zkolang: add a private witness with secret inputs
Add a secret declaration: a private input that feeds the run but never enters
the public statement, so a program can prove knowledge of a hidden value that
satisfies a public relation, for example a square root, without revealing it.
The compiler indexes public inputs as a prefix and secrets after it, the AIR
binds only the public prefix, and the driver takes a public vector and a secret
vector. This is a private witness, not full hiding: the STARK is not itself
zero-knowledge, which the docs and paper state plainly. 36 host proofs.
</commit_message>
<xml_diff>
--- a/verification/research/nonos-zkolang.docx
+++ b/verification/research/nonos-zkolang.docx
@@ -210,7 +210,7 @@
         <w:t xml:space="preserve"> </w:t>
       </w:r>
       <w:r>
-        <w:t xml:space="preserve">shapes and an accept-and-reject evidence suite of thirty in-process proofs. We</w:t>
+        <w:t xml:space="preserve">shapes and an accept-and-reject evidence suite of thirty-six in-process proofs. We</w:t>
       </w:r>
       <w:r>
         <w:t xml:space="preserve"> </w:t>
@@ -739,6 +739,18 @@
         <w:rPr>
           <w:rStyle w:val="VerbatimChar"/>
         </w:rPr>
+        <w:t xml:space="preserve">secret</w:t>
+      </w:r>
+      <w:r>
+        <w:t xml:space="preserve">,</w:t>
+      </w:r>
+      <w:r>
+        <w:t xml:space="preserve"> </w:t>
+      </w:r>
+      <w:r>
+        <w:rPr>
+          <w:rStyle w:val="VerbatimChar"/>
+        </w:rPr>
         <w:t xml:space="preserve">output</w:t>
       </w:r>
       <w:r>
@@ -846,7 +858,7 @@
         <w:rPr>
           <w:rStyle w:val="VerbatimChar"/>
         </w:rPr>
-        <w:t xml:space="preserve">          | 'input' ident ';' | 'output' expr ';'</w:t>
+        <w:t xml:space="preserve">          | 'input' ident ';' | 'secret' ident ';' | 'output' expr ';'</w:t>
       </w:r>
       <w:r>
         <w:br/>
@@ -1088,7 +1100,43 @@
         <w:t xml:space="preserve"> </w:t>
       </w:r>
       <w:r>
-        <w:t xml:space="preserve">to the next public input, and</w:t>
+        <w:t xml:space="preserve">to the next public input,</w:t>
+      </w:r>
+      <w:r>
+        <w:t xml:space="preserve"> </w:t>
+      </w:r>
+      <w:r>
+        <w:rPr>
+          <w:rStyle w:val="VerbatimChar"/>
+        </w:rPr>
+        <w:t xml:space="preserve">secret w</w:t>
+      </w:r>
+      <w:r>
+        <w:t xml:space="preserve"> </w:t>
+      </w:r>
+      <w:r>
+        <w:t xml:space="preserve">binds</w:t>
+      </w:r>
+      <w:r>
+        <w:t xml:space="preserve"> </w:t>
+      </w:r>
+      <w:r>
+        <w:rPr>
+          <w:rStyle w:val="VerbatimChar"/>
+        </w:rPr>
+        <w:t xml:space="preserve">w</w:t>
+      </w:r>
+      <w:r>
+        <w:t xml:space="preserve"> </w:t>
+      </w:r>
+      <w:r>
+        <w:t xml:space="preserve">to a private</w:t>
+      </w:r>
+      <w:r>
+        <w:t xml:space="preserve"> </w:t>
+      </w:r>
+      <w:r>
+        <w:t xml:space="preserve">witness that never enters the public statement, and</w:t>
       </w:r>
       <w:r>
         <w:t xml:space="preserve"> </w:t>
@@ -1118,7 +1166,13 @@
         <w:t xml:space="preserve"> </w:t>
       </w:r>
       <w:r>
-        <w:t xml:space="preserve">as the next public output.</w:t>
+        <w:t xml:space="preserve">as the</w:t>
+      </w:r>
+      <w:r>
+        <w:t xml:space="preserve"> </w:t>
+      </w:r>
+      <w:r>
+        <w:t xml:space="preserve">next public output.</w:t>
       </w:r>
     </w:p>
     <w:p>
@@ -3414,7 +3468,7 @@
         <w:pStyle w:val="BodyText"/>
       </w:pPr>
       <w:r>
-        <w:t xml:space="preserve">The correctness evidence is a suite of thirty in-process proofs in</w:t>
+        <w:t xml:space="preserve">The correctness evidence is a suite of thirty-six in-process proofs in</w:t>
       </w:r>
       <w:r>
         <w:t xml:space="preserve"> </w:t>
@@ -3486,19 +3540,43 @@
         <w:t xml:space="preserve"> </w:t>
       </w:r>
       <w:r>
-        <w:t xml:space="preserve">forged public input; and a forged public output. The language is covered end to</w:t>
-      </w:r>
-      <w:r>
-        <w:t xml:space="preserve"> </w:t>
-      </w:r>
-      <w:r>
-        <w:t xml:space="preserve">end: a true program verifies, a false claim yields no proof, and a malformed</w:t>
-      </w:r>
-      <w:r>
-        <w:t xml:space="preserve"> </w:t>
-      </w:r>
-      <w:r>
-        <w:t xml:space="preserve">program is a typed compile error.</w:t>
+        <w:t xml:space="preserve">forged public input; and a forged public output. The statement binding is</w:t>
+      </w:r>
+      <w:r>
+        <w:t xml:space="preserve"> </w:t>
+      </w:r>
+      <w:r>
+        <w:t xml:space="preserve">exercised too: a proof bound to one program commitment or trace length is rejected</w:t>
+      </w:r>
+      <w:r>
+        <w:t xml:space="preserve"> </w:t>
+      </w:r>
+      <w:r>
+        <w:t xml:space="preserve">under a forged one, since the public statement seeds the Fiat-Shamir transcript.</w:t>
+      </w:r>
+      <w:r>
+        <w:t xml:space="preserve"> </w:t>
+      </w:r>
+      <w:r>
+        <w:t xml:space="preserve">The private witness is covered: a program proves knowledge of a secret square root</w:t>
+      </w:r>
+      <w:r>
+        <w:t xml:space="preserve"> </w:t>
+      </w:r>
+      <w:r>
+        <w:t xml:space="preserve">without the witness entering the public statement, and a wrong witness yields no</w:t>
+      </w:r>
+      <w:r>
+        <w:t xml:space="preserve"> </w:t>
+      </w:r>
+      <w:r>
+        <w:t xml:space="preserve">proof. The language is covered end to end: a true program verifies, a false claim</w:t>
+      </w:r>
+      <w:r>
+        <w:t xml:space="preserve"> </w:t>
+      </w:r>
+      <w:r>
+        <w:t xml:space="preserve">yields no proof, and a malformed program is a typed compile error.</w:t>
       </w:r>
     </w:p>
     <w:bookmarkEnd w:id="19"/>
@@ -3661,19 +3739,40 @@
         <w:t xml:space="preserve"> </w:t>
       </w:r>
       <w:r>
-        <w:t xml:space="preserve">constraint region; a private witness so that an input can be hidden from the</w:t>
-      </w:r>
-      <w:r>
-        <w:t xml:space="preserve"> </w:t>
-      </w:r>
-      <w:r>
-        <w:t xml:space="preserve">verifier, which zKølang does not offer today since all inputs are public; and the</w:t>
-      </w:r>
-      <w:r>
-        <w:t xml:space="preserve"> </w:t>
-      </w:r>
-      <w:r>
-        <w:t xml:space="preserve">on-chain settlement of the NOX fee. None of these is in the tree, and no claim</w:t>
+        <w:t xml:space="preserve">constraint region; full zero-knowledge, a hiding proof, since a</w:t>
+      </w:r>
+      <w:r>
+        <w:t xml:space="preserve"> </w:t>
+      </w:r>
+      <w:r>
+        <w:rPr>
+          <w:rStyle w:val="VerbatimChar"/>
+        </w:rPr>
+        <w:t xml:space="preserve">secret</w:t>
+      </w:r>
+      <w:r>
+        <w:t xml:space="preserve"> </w:t>
+      </w:r>
+      <w:r>
+        <w:t xml:space="preserve">input is</w:t>
+      </w:r>
+      <w:r>
+        <w:t xml:space="preserve"> </w:t>
+      </w:r>
+      <w:r>
+        <w:t xml:space="preserve">a private witness kept out of the public statement but the STARK is not yet hiding</w:t>
+      </w:r>
+      <w:r>
+        <w:t xml:space="preserve"> </w:t>
+      </w:r>
+      <w:r>
+        <w:t xml:space="preserve">so the openings could leak trace values; and the on-chain settlement of the NOX</w:t>
+      </w:r>
+      <w:r>
+        <w:t xml:space="preserve"> </w:t>
+      </w:r>
+      <w:r>
+        <w:t xml:space="preserve">fee. None of these is in the tree, and no claim</w:t>
       </w:r>
       <w:r>
         <w:t xml:space="preserve"> </w:t>

</xml_diff>

<commit_message>
zkolang: register reuse and a recipes suite
Reuse physical registers for dead temporaries, so register pressure follows an
expression's depth rather than its size and real programs like a range proof fit
the sixteen-register file. Register indices stay compile-time constants, so the
AIR's register binding is unchanged and the reuse is invisible to it. Add a
recipes suite of tested use cases: delegated computation, knowledge of a secret
solution, private set membership, solvency by conservation, and a range proof.
41 host proofs.
</commit_message>
<xml_diff>
--- a/verification/research/nonos-zkolang.docx
+++ b/verification/research/nonos-zkolang.docx
@@ -920,7 +920,7 @@
         <w:pStyle w:val="FirstParagraph"/>
       </w:pPr>
       <w:r>
-        <w:t xml:space="preserve">The semantics are straight-line and single-assignment. A</w:t>
+        <w:t xml:space="preserve">The semantics are straight-line and single-assignment at the source level. A</w:t>
       </w:r>
       <w:r>
         <w:t xml:space="preserve"> </w:t>
@@ -935,19 +935,31 @@
         <w:t xml:space="preserve"> </w:t>
       </w:r>
       <w:r>
-        <w:t xml:space="preserve">evaluates its</w:t>
-      </w:r>
-      <w:r>
-        <w:t xml:space="preserve"> </w:t>
-      </w:r>
-      <w:r>
-        <w:t xml:space="preserve">expression and binds a name to the result; a name resolves to the most recent</w:t>
-      </w:r>
-      <w:r>
-        <w:t xml:space="preserve"> </w:t>
-      </w:r>
-      <w:r>
-        <w:t xml:space="preserve">binding, giving lexical shadowing. Arithmetic is field add, subtract, and</w:t>
+        <w:t xml:space="preserve">evaluates its expression and binds a name to the result; a name resolves to the</w:t>
+      </w:r>
+      <w:r>
+        <w:t xml:space="preserve"> </w:t>
+      </w:r>
+      <w:r>
+        <w:t xml:space="preserve">most recent binding, giving lexical shadowing. The compiler reuses physical</w:t>
+      </w:r>
+      <w:r>
+        <w:t xml:space="preserve"> </w:t>
+      </w:r>
+      <w:r>
+        <w:t xml:space="preserve">registers once a temporary is dead, so register indices stay compile-time</w:t>
+      </w:r>
+      <w:r>
+        <w:t xml:space="preserve"> </w:t>
+      </w:r>
+      <w:r>
+        <w:t xml:space="preserve">constants (which is all the register binding needs) while larger programs fit the</w:t>
+      </w:r>
+      <w:r>
+        <w:t xml:space="preserve"> </w:t>
+      </w:r>
+      <w:r>
+        <w:t xml:space="preserve">sixteen-register file. Arithmetic is field add, subtract, and</w:t>
       </w:r>
       <w:r>
         <w:t xml:space="preserve"> </w:t>

</xml_diff>

<commit_message>
zkolang: add bounded for loops, unrolled at compile time
Add for i in lo .. hi { ... }. The loop variable is a compile-time constant and
the compiler unrolls the range, so a program's shape stays static and a loop is
exactly its hand-unrolled body: an accumulator, a power, or reading a run of
inputs. The public-input count is computed through loops so the public prefix is
sized right, and an oversized range is a compile error. Docs and paper grammars
are brought current with the division, not-equal, unary-minus, and for additions,
so the front-end description matches the code. 52 host proofs.
</commit_message>
<xml_diff>
--- a/verification/research/nonos-zkolang.docx
+++ b/verification/research/nonos-zkolang.docx
@@ -210,7 +210,7 @@
         <w:t xml:space="preserve"> </w:t>
       </w:r>
       <w:r>
-        <w:t xml:space="preserve">shapes and an accept-and-reject evidence suite of thirty-six in-process proofs. We</w:t>
+        <w:t xml:space="preserve">shapes and an accept-and-reject evidence suite of fifty-two in-process proofs. We</w:t>
       </w:r>
       <w:r>
         <w:t xml:space="preserve"> </w:t>
@@ -778,6 +778,30 @@
         <w:t xml:space="preserve">sel</w:t>
       </w:r>
       <w:r>
+        <w:t xml:space="preserve">,</w:t>
+      </w:r>
+      <w:r>
+        <w:t xml:space="preserve"> </w:t>
+      </w:r>
+      <w:r>
+        <w:rPr>
+          <w:rStyle w:val="VerbatimChar"/>
+        </w:rPr>
+        <w:t xml:space="preserve">for</w:t>
+      </w:r>
+      <w:r>
+        <w:t xml:space="preserve">,</w:t>
+      </w:r>
+      <w:r>
+        <w:t xml:space="preserve"> </w:t>
+      </w:r>
+      <w:r>
+        <w:rPr>
+          <w:rStyle w:val="VerbatimChar"/>
+        </w:rPr>
+        <w:t xml:space="preserve">in</w:t>
+      </w:r>
+      <w:r>
         <w:t xml:space="preserve">, the operators</w:t>
       </w:r>
       <w:r>
@@ -787,34 +811,43 @@
         <w:rPr>
           <w:rStyle w:val="VerbatimChar"/>
         </w:rPr>
-        <w:t xml:space="preserve">+ - * ==</w:t>
-      </w:r>
-      <w:r>
-        <w:t xml:space="preserve">, the</w:t>
-      </w:r>
-      <w:r>
-        <w:t xml:space="preserve"> </w:t>
-      </w:r>
-      <w:r>
-        <w:t xml:space="preserve">punctuation</w:t>
-      </w:r>
-      <w:r>
-        <w:t xml:space="preserve"> </w:t>
-      </w:r>
-      <w:r>
-        <w:rPr>
-          <w:rStyle w:val="VerbatimChar"/>
-        </w:rPr>
-        <w:t xml:space="preserve">( ) , ;</w:t>
-      </w:r>
-      <w:r>
-        <w:t xml:space="preserve">, identifiers, and decimal numerals</w:t>
-      </w:r>
-      <w:r>
-        <w:t xml:space="preserve"> </w:t>
-      </w:r>
-      <w:r>
-        <w:t xml:space="preserve">(</w:t>
+        <w:t xml:space="preserve">+ - * / == !=</w:t>
+      </w:r>
+      <w:r>
+        <w:t xml:space="preserve"> </w:t>
+      </w:r>
+      <w:r>
+        <w:t xml:space="preserve">and unary</w:t>
+      </w:r>
+      <w:r>
+        <w:t xml:space="preserve"> </w:t>
+      </w:r>
+      <w:r>
+        <w:rPr>
+          <w:rStyle w:val="VerbatimChar"/>
+        </w:rPr>
+        <w:t xml:space="preserve">-</w:t>
+      </w:r>
+      <w:r>
+        <w:t xml:space="preserve">, the punctuation</w:t>
+      </w:r>
+      <w:r>
+        <w:t xml:space="preserve"> </w:t>
+      </w:r>
+      <w:r>
+        <w:rPr>
+          <w:rStyle w:val="VerbatimChar"/>
+        </w:rPr>
+        <w:t xml:space="preserve">( ) , ; { } ..</w:t>
+      </w:r>
+      <w:r>
+        <w:t xml:space="preserve">, identifiers, and</w:t>
+      </w:r>
+      <w:r>
+        <w:t xml:space="preserve"> </w:t>
+      </w:r>
+      <w:r>
+        <w:t xml:space="preserve">decimal numerals (</w:t>
       </w:r>
       <w:r>
         <w:rPr>
@@ -823,13 +856,13 @@
         <w:t xml:space="preserve">userland/nonos_zkolang/src/lang/lex.rs</w:t>
       </w:r>
       <w:r>
-        <w:t xml:space="preserve">). The grammar, lowest precedence first,</w:t>
-      </w:r>
-      <w:r>
-        <w:t xml:space="preserve"> </w:t>
-      </w:r>
-      <w:r>
-        <w:t xml:space="preserve">is:</w:t>
+        <w:t xml:space="preserve">). The grammar, lowest</w:t>
+      </w:r>
+      <w:r>
+        <w:t xml:space="preserve"> </w:t>
+      </w:r>
+      <w:r>
+        <w:t xml:space="preserve">precedence first, is:</w:t>
       </w:r>
     </w:p>
     <w:p>
@@ -867,6 +900,15 @@
         <w:rPr>
           <w:rStyle w:val="VerbatimChar"/>
         </w:rPr>
+        <w:t xml:space="preserve">          | 'for' ident 'in' number '..' number '{' stmt* '}'</w:t>
+      </w:r>
+      <w:r>
+        <w:br/>
+      </w:r>
+      <w:r>
+        <w:rPr>
+          <w:rStyle w:val="VerbatimChar"/>
+        </w:rPr>
         <w:t xml:space="preserve">expr     := equality</w:t>
       </w:r>
       <w:r>
@@ -876,7 +918,7 @@
         <w:rPr>
           <w:rStyle w:val="VerbatimChar"/>
         </w:rPr>
-        <w:t xml:space="preserve">equality := sum ('==' sum)?</w:t>
+        <w:t xml:space="preserve">equality := sum (('==' | '!=') sum)?</w:t>
       </w:r>
       <w:r>
         <w:br/>
@@ -894,7 +936,16 @@
         <w:rPr>
           <w:rStyle w:val="VerbatimChar"/>
         </w:rPr>
-        <w:t xml:space="preserve">product  := primary ('*' primary)*</w:t>
+        <w:t xml:space="preserve">product  := unary (('*' | '/') unary)*</w:t>
+      </w:r>
+      <w:r>
+        <w:br/>
+      </w:r>
+      <w:r>
+        <w:rPr>
+          <w:rStyle w:val="VerbatimChar"/>
+        </w:rPr>
+        <w:t xml:space="preserve">unary    := '-' unary | primary</w:t>
       </w:r>
       <w:r>
         <w:br/>
@@ -3480,7 +3531,7 @@
         <w:pStyle w:val="BodyText"/>
       </w:pPr>
       <w:r>
-        <w:t xml:space="preserve">The correctness evidence is a suite of thirty-six in-process proofs in</w:t>
+        <w:t xml:space="preserve">The correctness evidence is a suite of fifty-two in-process proofs in</w:t>
       </w:r>
       <w:r>
         <w:t xml:space="preserve"> </w:t>

</xml_diff>

<commit_message>
zkolang: if/else expression, comparison asserts, and register reclaim
Add an if/else expression, sugar for sel, so a conditional reads in a familiar
shape while staying branchless. Make assert comparison-aware: assert a == b
proves equality and assert a != b proves inequality, the latter by inverting the
difference. Reclaim a shadowed binding's register when no other name holds it,
with an alias check that keeps it sound, so a long accumulator loop no longer
exhausts the register file. Docs and paper grammars follow. 58 host proofs.
</commit_message>
<xml_diff>
--- a/verification/research/nonos-zkolang.docx
+++ b/verification/research/nonos-zkolang.docx
@@ -210,7 +210,7 @@
         <w:t xml:space="preserve"> </w:t>
       </w:r>
       <w:r>
-        <w:t xml:space="preserve">shapes and an accept-and-reject evidence suite of fifty-two in-process proofs. We</w:t>
+        <w:t xml:space="preserve">shapes and an accept-and-reject evidence suite of fifty-eight in-process proofs. We</w:t>
       </w:r>
       <w:r>
         <w:t xml:space="preserve"> </w:t>
@@ -802,6 +802,30 @@
         <w:t xml:space="preserve">in</w:t>
       </w:r>
       <w:r>
+        <w:t xml:space="preserve">,</w:t>
+      </w:r>
+      <w:r>
+        <w:t xml:space="preserve"> </w:t>
+      </w:r>
+      <w:r>
+        <w:rPr>
+          <w:rStyle w:val="VerbatimChar"/>
+        </w:rPr>
+        <w:t xml:space="preserve">if</w:t>
+      </w:r>
+      <w:r>
+        <w:t xml:space="preserve">,</w:t>
+      </w:r>
+      <w:r>
+        <w:t xml:space="preserve"> </w:t>
+      </w:r>
+      <w:r>
+        <w:rPr>
+          <w:rStyle w:val="VerbatimChar"/>
+        </w:rPr>
+        <w:t xml:space="preserve">else</w:t>
+      </w:r>
+      <w:r>
         <w:t xml:space="preserve">, the operators</w:t>
       </w:r>
       <w:r>
@@ -965,6 +989,15 @@
         </w:rPr>
         <w:t xml:space="preserve">          | 'inv' '(' expr ')' | 'sel' '(' expr ',' expr ',' expr ')'</w:t>
       </w:r>
+      <w:r>
+        <w:br/>
+      </w:r>
+      <w:r>
+        <w:rPr>
+          <w:rStyle w:val="VerbatimChar"/>
+        </w:rPr>
+        <w:t xml:space="preserve">          | 'if' expr '{' expr '}' 'else' '{' expr '}'</w:t>
+      </w:r>
     </w:p>
     <w:p>
       <w:pPr>
@@ -1064,10 +1097,25 @@
         <w:t xml:space="preserve">sel(c, a, b)</w:t>
       </w:r>
       <w:r>
-        <w:t xml:space="preserve"> </w:t>
-      </w:r>
-      <w:r>
-        <w:t xml:space="preserve">is a branchless conditional over a boolean</w:t>
+        <w:t xml:space="preserve">, and its familiar form</w:t>
+      </w:r>
+      <w:r>
+        <w:t xml:space="preserve"> </w:t>
+      </w:r>
+      <w:r>
+        <w:rPr>
+          <w:rStyle w:val="VerbatimChar"/>
+        </w:rPr>
+        <w:t xml:space="preserve">if c { a } else { b }</w:t>
+      </w:r>
+      <w:r>
+        <w:t xml:space="preserve">, is a branchless</w:t>
+      </w:r>
+      <w:r>
+        <w:t xml:space="preserve"> </w:t>
+      </w:r>
+      <w:r>
+        <w:t xml:space="preserve">conditional over a boolean</w:t>
       </w:r>
       <w:r>
         <w:t xml:space="preserve"> </w:t>
@@ -1079,13 +1127,7 @@
         <w:t xml:space="preserve">c</w:t>
       </w:r>
       <w:r>
-        <w:t xml:space="preserve">, evaluating both arms</w:t>
-      </w:r>
-      <w:r>
-        <w:t xml:space="preserve"> </w:t>
-      </w:r>
-      <w:r>
-        <w:t xml:space="preserve">and selecting one.</w:t>
+        <w:t xml:space="preserve">, evaluating both arms and selecting one.</w:t>
       </w:r>
       <w:r>
         <w:t xml:space="preserve"> </w:t>
@@ -1115,25 +1157,49 @@
         <w:t xml:space="preserve"> </w:t>
       </w:r>
       <w:r>
-        <w:t xml:space="preserve">is zero, so equality of two values is</w:t>
-      </w:r>
-      <w:r>
-        <w:t xml:space="preserve"> </w:t>
-      </w:r>
-      <w:r>
-        <w:t xml:space="preserve">written</w:t>
-      </w:r>
-      <w:r>
-        <w:t xml:space="preserve"> </w:t>
-      </w:r>
-      <w:r>
-        <w:rPr>
-          <w:rStyle w:val="VerbatimChar"/>
-        </w:rPr>
-        <w:t xml:space="preserve">assert x - y</w:t>
-      </w:r>
-      <w:r>
-        <w:t xml:space="preserve">.</w:t>
+        <w:t xml:space="preserve">is zero; the forms</w:t>
+      </w:r>
+      <w:r>
+        <w:t xml:space="preserve"> </w:t>
+      </w:r>
+      <w:r>
+        <w:rPr>
+          <w:rStyle w:val="VerbatimChar"/>
+        </w:rPr>
+        <w:t xml:space="preserve">assert a == b</w:t>
+      </w:r>
+      <w:r>
+        <w:t xml:space="preserve"> </w:t>
+      </w:r>
+      <w:r>
+        <w:t xml:space="preserve">and</w:t>
+      </w:r>
+      <w:r>
+        <w:t xml:space="preserve"> </w:t>
+      </w:r>
+      <w:r>
+        <w:rPr>
+          <w:rStyle w:val="VerbatimChar"/>
+        </w:rPr>
+        <w:t xml:space="preserve">assert a != b</w:t>
+      </w:r>
+      <w:r>
+        <w:t xml:space="preserve"> </w:t>
+      </w:r>
+      <w:r>
+        <w:t xml:space="preserve">read the</w:t>
+      </w:r>
+      <w:r>
+        <w:t xml:space="preserve"> </w:t>
+      </w:r>
+      <w:r>
+        <w:t xml:space="preserve">same intent, the first asserting the difference is zero, the second inverting it so</w:t>
+      </w:r>
+      <w:r>
+        <w:t xml:space="preserve"> </w:t>
+      </w:r>
+      <w:r>
+        <w:t xml:space="preserve">the assertion fails only when they are equal.</w:t>
       </w:r>
       <w:r>
         <w:t xml:space="preserve"> </w:t>
@@ -3531,7 +3597,7 @@
         <w:pStyle w:val="BodyText"/>
       </w:pPr>
       <w:r>
-        <w:t xml:space="preserve">The correctness evidence is a suite of fifty-two in-process proofs in</w:t>
+        <w:t xml:space="preserve">The correctness evidence is a suite of fifty-eight in-process proofs in</w:t>
       </w:r>
       <w:r>
         <w:t xml:space="preserve"> </w:t>

</xml_diff>